<commit_message>
Refine project framing around real-time TDoA
Update the project name across the README and faculty list, simplify the Sprint 1 mission around shared-map tracking and potential safety concerns, and revise the proposal documents.
</commit_message>
<xml_diff>
--- a/proposal/UWB_Project_Proposal.docx
+++ b/proposal/UWB_Project_Proposal.docx
@@ -7,7 +7,7 @@
         <w:pStyle w:val="Title"/>
       </w:pPr>
       <w:r>
-        <w:t>UWB Indoor Localization Project Proposal</w:t>
+        <w:t>UWB TDoA Real-time Localization Proposal</w:t>
       </w:r>
     </w:p>
     <w:p>
@@ -4800,7 +4800,7 @@
       <w:rPr>
         <w:sz w:val="18"/>
       </w:rPr>
-      <w:t>EC601   |   UWB indoor localization proposal</w:t>
+      <w:t>EC601   |   UWB TDoA Real-time Localization proposal</w:t>
     </w:r>
   </w:p>
 </w:hdr>

</xml_diff>